<commit_message>
NPC setup and animation integration
</commit_message>
<xml_diff>
--- a/Environmental Animation Template Instructions.docx
+++ b/Environmental Animation Template Instructions.docx
@@ -1,13 +1,11 @@
 
 <file path=word/document.xml><?xml version="1.0" encoding="utf-8"?>
-<w:document xmlns:wpc="http://schemas.microsoft.com/office/word/2010/wordprocessingCanvas" xmlns:cx="http://schemas.microsoft.com/office/drawing/2014/chartex" xmlns:cx1="http://schemas.microsoft.com/office/drawing/2015/9/8/chartex" xmlns:cx2="http://schemas.microsoft.com/office/drawing/2015/10/21/chartex" xmlns:cx3="http://schemas.microsoft.com/office/drawing/2016/5/9/chartex" xmlns:cx4="http://schemas.microsoft.com/office/drawing/2016/5/10/chartex" xmlns:cx5="http://schemas.microsoft.com/office/drawing/2016/5/11/chartex" xmlns:cx6="http://schemas.microsoft.com/office/drawing/2016/5/12/chartex" xmlns:cx7="http://schemas.microsoft.com/office/drawing/2016/5/13/chartex" xmlns:cx8="http://schemas.microsoft.com/office/drawing/2016/5/14/chartex" xmlns:mc="http://schemas.openxmlformats.org/markup-compatibility/2006" xmlns:aink="http://schemas.microsoft.com/office/drawing/2016/ink" xmlns:am3d="http://schemas.microsoft.com/office/drawing/2017/model3d" xmlns:o="urn:schemas-microsoft-com:office:office" xmlns:r="http://schemas.openxmlformats.org/officeDocument/2006/relationships" xmlns:m="http://schemas.openxmlformats.org/officeDocument/2006/math" xmlns:v="urn:schemas-microsoft-com:vml" xmlns:wp14="http://schemas.microsoft.com/office/word/2010/wordprocessingDrawing" xmlns:wp="http://schemas.openxmlformats.org/drawingml/2006/wordprocessingDrawing" xmlns:w10="urn:schemas-microsoft-com:office:word" xmlns:w="http://schemas.openxmlformats.org/wordprocessingml/2006/main" xmlns:w14="http://schemas.microsoft.com/office/word/2010/wordml" xmlns:w15="http://schemas.microsoft.com/office/word/2012/wordml" xmlns:w16cid="http://schemas.microsoft.com/office/word/2016/wordml/cid" xmlns:w16se="http://schemas.microsoft.com/office/word/2015/wordml/symex" xmlns:wpg="http://schemas.microsoft.com/office/word/2010/wordprocessingGroup" xmlns:wpi="http://schemas.microsoft.com/office/word/2010/wordprocessingInk" xmlns:wne="http://schemas.microsoft.com/office/word/2006/wordml" xmlns:wps="http://schemas.microsoft.com/office/word/2010/wordprocessingShape" mc:Ignorable="w14 w15 w16se w16cid wp14">
+<w:document xmlns:wpc="http://schemas.microsoft.com/office/word/2010/wordprocessingCanvas" xmlns:cx="http://schemas.microsoft.com/office/drawing/2014/chartex" xmlns:cx1="http://schemas.microsoft.com/office/drawing/2015/9/8/chartex" xmlns:cx2="http://schemas.microsoft.com/office/drawing/2015/10/21/chartex" xmlns:cx3="http://schemas.microsoft.com/office/drawing/2016/5/9/chartex" xmlns:cx4="http://schemas.microsoft.com/office/drawing/2016/5/10/chartex" xmlns:cx5="http://schemas.microsoft.com/office/drawing/2016/5/11/chartex" xmlns:cx6="http://schemas.microsoft.com/office/drawing/2016/5/12/chartex" xmlns:cx7="http://schemas.microsoft.com/office/drawing/2016/5/13/chartex" xmlns:cx8="http://schemas.microsoft.com/office/drawing/2016/5/14/chartex" xmlns:mc="http://schemas.openxmlformats.org/markup-compatibility/2006" xmlns:aink="http://schemas.microsoft.com/office/drawing/2016/ink" xmlns:am3d="http://schemas.microsoft.com/office/drawing/2017/model3d" xmlns:o="urn:schemas-microsoft-com:office:office" xmlns:oel="http://schemas.microsoft.com/office/2019/extlst" xmlns:r="http://schemas.openxmlformats.org/officeDocument/2006/relationships" xmlns:m="http://schemas.openxmlformats.org/officeDocument/2006/math" xmlns:v="urn:schemas-microsoft-com:vml" xmlns:wp14="http://schemas.microsoft.com/office/word/2010/wordprocessingDrawing" xmlns:wp="http://schemas.openxmlformats.org/drawingml/2006/wordprocessingDrawing" xmlns:w10="urn:schemas-microsoft-com:office:word" xmlns:w="http://schemas.openxmlformats.org/wordprocessingml/2006/main" xmlns:w14="http://schemas.microsoft.com/office/word/2010/wordml" xmlns:w15="http://schemas.microsoft.com/office/word/2012/wordml" xmlns:w16cex="http://schemas.microsoft.com/office/word/2018/wordml/cex" xmlns:w16cid="http://schemas.microsoft.com/office/word/2016/wordml/cid" xmlns:w16="http://schemas.microsoft.com/office/word/2018/wordml" xmlns:w16du="http://schemas.microsoft.com/office/word/2023/wordml/word16du" xmlns:w16sdtdh="http://schemas.microsoft.com/office/word/2020/wordml/sdtdatahash" xmlns:w16sdtfl="http://schemas.microsoft.com/office/word/2024/wordml/sdtformatlock" xmlns:w16se="http://schemas.microsoft.com/office/word/2015/wordml/symex" xmlns:wpg="http://schemas.microsoft.com/office/word/2010/wordprocessingGroup" xmlns:wpi="http://schemas.microsoft.com/office/word/2010/wordprocessingInk" xmlns:wne="http://schemas.microsoft.com/office/word/2006/wordml" xmlns:wps="http://schemas.microsoft.com/office/word/2010/wordprocessingShape" mc:Ignorable="w14 w15 w16se w16cid w16 w16cex w16sdtdh w16sdtfl w16du wp14">
   <w:body>
     <w:p>
       <w:pPr>
         <w:pStyle w:val="Title"/>
       </w:pPr>
-      <w:bookmarkStart w:id="0" w:name="_GoBack"/>
-      <w:bookmarkEnd w:id="0"/>
       <w:r>
         <w:t>Environmental Animation Template</w:t>
       </w:r>
@@ -741,23 +739,7 @@
     </w:p>
     <w:p>
       <w:r>
-        <w:t xml:space="preserve">The Animation Blueprint consists of two parts: </w:t>
-      </w:r>
-      <w:proofErr w:type="gramStart"/>
-      <w:r>
-        <w:t>the</w:t>
-      </w:r>
-      <w:proofErr w:type="gramEnd"/>
-      <w:r>
-        <w:t xml:space="preserve"> Event Graph, which holds the logic used to capture and calculate values, and the </w:t>
-      </w:r>
-      <w:proofErr w:type="spellStart"/>
-      <w:r>
-        <w:t>Anim</w:t>
-      </w:r>
-      <w:proofErr w:type="spellEnd"/>
-      <w:r>
-        <w:t xml:space="preserve"> Graph, which holds the state machines, players and blend nodes used to calculate the final pose. Both are layered in the middle of the screen, accessible by tabs. The left side of the screen includes a preview of the output, an overview of all functions and graphs, and a container for </w:t>
+        <w:t xml:space="preserve">The Animation Blueprint consists of two parts: the Event Graph, which holds the logic used to capture and calculate values, and the Anim Graph, which holds the state machines, players and blend nodes used to calculate the final pose. Both are layered in the middle of the screen, accessible by tabs. The left side of the screen includes a preview of the output, an overview of all functions and graphs, and a container for </w:t>
       </w:r>
       <w:r>
         <w:rPr>
@@ -766,15 +748,7 @@
         <w:t>variables</w:t>
       </w:r>
       <w:r>
-        <w:t xml:space="preserve"> – the calculated values from the Event Graph that will be applied to the </w:t>
-      </w:r>
-      <w:proofErr w:type="spellStart"/>
-      <w:r>
-        <w:t>Anim</w:t>
-      </w:r>
-      <w:proofErr w:type="spellEnd"/>
-      <w:r>
-        <w:t xml:space="preserve"> Graph.</w:t>
+        <w:t xml:space="preserve"> – the calculated values from the Event Graph that will be applied to the Anim Graph.</w:t>
       </w:r>
     </w:p>
     <w:p>
@@ -939,20 +913,25 @@
     </w:p>
     <w:p>
       <w:r>
-        <w:t xml:space="preserve">Now move to the </w:t>
+        <w:t>Now move to the Anim Graph. You should see a node with a running character on it marked “Output Pose”. This graph works similarly to the Event Graph, but instead of triggers and functions, it uses Animation Players, State Machines and Blend Nodes, together with variables from the Event Graph, to calculate the final pose for the character within each frame.</w:t>
+      </w:r>
+    </w:p>
+    <w:p>
+      <w:r>
+        <w:t xml:space="preserve">We simply want to play our </w:t>
       </w:r>
       <w:proofErr w:type="spellStart"/>
       <w:r>
-        <w:t>Anim</w:t>
+        <w:t>BlendSpace</w:t>
       </w:r>
       <w:proofErr w:type="spellEnd"/>
       <w:r>
-        <w:t xml:space="preserve"> Graph. You should see a node with a running character on it marked “Output Pose”. This graph works similarly to the Event Graph, but instead of triggers and functions, it uses Animation Players, State Machines and Blend Nodes, together with variables from the Event Graph, to calculate the final pose for the character within each frame.</w:t>
-      </w:r>
-    </w:p>
-    <w:p>
-      <w:r>
-        <w:t xml:space="preserve">We simply want to play our </w:t>
+        <w:t>, and drive the value using the Speed variable we just calculated.</w:t>
+      </w:r>
+    </w:p>
+    <w:p>
+      <w:r>
+        <w:t xml:space="preserve">In the bottom-right corner, look for the </w:t>
       </w:r>
       <w:proofErr w:type="spellStart"/>
       <w:r>
@@ -960,74 +939,53 @@
       </w:r>
       <w:proofErr w:type="spellEnd"/>
       <w:r>
-        <w:t>, and drive the value using the Speed variable we just calculated.</w:t>
-      </w:r>
-    </w:p>
-    <w:p>
-      <w:r>
-        <w:t xml:space="preserve">In the bottom-right corner, look for the </w:t>
+        <w:t xml:space="preserve"> you made earlier, and drag it onto the Anim Graph (be sure to leave </w:t>
+      </w:r>
+      <w:r>
+        <w:rPr>
+          <w:i/>
+        </w:rPr>
+        <w:t>plenty</w:t>
+      </w:r>
+      <w:r>
+        <w:t xml:space="preserve"> room between it and the Output Pose). It should appear as a node, with two variable pins on the left-hand side, referring to the two axes of the graph, one of which should be named “Speed” (the name you gave the vertical axis earlier). Rather than a white triangle, this should have an icon of a running character, which is the </w:t>
+      </w:r>
+      <w:r>
+        <w:rPr>
+          <w:i/>
+        </w:rPr>
+        <w:t>pose</w:t>
+      </w:r>
+      <w:r>
+        <w:t xml:space="preserve"> pin.</w:t>
+      </w:r>
+    </w:p>
+    <w:p>
+      <w:r>
+        <w:t xml:space="preserve">First, drag the “Speed” variable onto the </w:t>
       </w:r>
       <w:proofErr w:type="spellStart"/>
       <w:r>
+        <w:t>AnimGraph</w:t>
+      </w:r>
+      <w:proofErr w:type="spellEnd"/>
+      <w:r>
+        <w:t xml:space="preserve">. Then drag out from the variable pin on the right hand </w:t>
+      </w:r>
+      <w:proofErr w:type="gramStart"/>
+      <w:r>
+        <w:t>side, and</w:t>
+      </w:r>
+      <w:proofErr w:type="gramEnd"/>
+      <w:r>
+        <w:t xml:space="preserve"> drop it onto the “speed” connection on the left-hand side of the </w:t>
+      </w:r>
+      <w:proofErr w:type="spellStart"/>
+      <w:r>
         <w:t>BlendSpace</w:t>
       </w:r>
       <w:proofErr w:type="spellEnd"/>
       <w:r>
-        <w:t xml:space="preserve"> you made earlier, and drag it onto the </w:t>
-      </w:r>
-      <w:proofErr w:type="spellStart"/>
-      <w:r>
-        <w:t>Anim</w:t>
-      </w:r>
-      <w:proofErr w:type="spellEnd"/>
-      <w:r>
-        <w:t xml:space="preserve"> Graph (be sure to leave </w:t>
-      </w:r>
-      <w:r>
-        <w:rPr>
-          <w:i/>
-        </w:rPr>
-        <w:t>plenty</w:t>
-      </w:r>
-      <w:r>
-        <w:t xml:space="preserve"> room between it and the Output Pose). It should appear as a node, with two variable pins on the left-hand side, referring to the two axes of the graph, one of which should be named “Speed” (the name you gave the vertical axis earlier). Rather than a white triangle, this should have an icon of a running character, which is the </w:t>
-      </w:r>
-      <w:r>
-        <w:rPr>
-          <w:i/>
-        </w:rPr>
-        <w:t>pose</w:t>
-      </w:r>
-      <w:r>
-        <w:t xml:space="preserve"> pin.</w:t>
-      </w:r>
-    </w:p>
-    <w:p>
-      <w:r>
-        <w:t xml:space="preserve">First, drag the “Speed” variable onto the </w:t>
-      </w:r>
-      <w:proofErr w:type="spellStart"/>
-      <w:r>
-        <w:t>AnimGraph</w:t>
-      </w:r>
-      <w:proofErr w:type="spellEnd"/>
-      <w:r>
-        <w:t xml:space="preserve">. Then drag out from the variable pin on the </w:t>
-      </w:r>
-      <w:proofErr w:type="gramStart"/>
-      <w:r>
-        <w:t>right hand</w:t>
-      </w:r>
-      <w:proofErr w:type="gramEnd"/>
-      <w:r>
-        <w:t xml:space="preserve"> side, and drop it onto the “speed” connection on the left-hand side of the </w:t>
-      </w:r>
-      <w:proofErr w:type="spellStart"/>
-      <w:r>
-        <w:t>BlendSpace</w:t>
-      </w:r>
-      <w:proofErr w:type="spellEnd"/>
-      <w:r>
         <w:t>.</w:t>
       </w:r>
     </w:p>
@@ -1042,15 +1000,7 @@
         <w:t>not</w:t>
       </w:r>
       <w:r>
-        <w:t xml:space="preserve"> included in the </w:t>
-      </w:r>
-      <w:proofErr w:type="spellStart"/>
-      <w:r>
-        <w:t>Anim</w:t>
-      </w:r>
-      <w:proofErr w:type="spellEnd"/>
-      <w:r>
-        <w:t xml:space="preserve"> Graph. Drag the “pose” pin from the </w:t>
+        <w:t xml:space="preserve"> included in the Anim Graph. Drag the “pose” pin from the </w:t>
       </w:r>
       <w:proofErr w:type="spellStart"/>
       <w:r>
@@ -1205,23 +1155,7 @@
     </w:p>
     <w:p>
       <w:r>
-        <w:t>Above this, under “</w:t>
-      </w:r>
-      <w:proofErr w:type="spellStart"/>
-      <w:r>
-        <w:t>Anim</w:t>
-      </w:r>
-      <w:proofErr w:type="spellEnd"/>
-      <w:r>
-        <w:t>”, set the “</w:t>
-      </w:r>
-      <w:proofErr w:type="spellStart"/>
-      <w:r>
-        <w:t>Anim</w:t>
-      </w:r>
-      <w:proofErr w:type="spellEnd"/>
-      <w:r>
-        <w:t xml:space="preserve"> Class” to the Animation Blueprint you created.</w:t>
+        <w:t>Above this, under “Anim”, set the “Anim Class” to the Animation Blueprint you created.</w:t>
       </w:r>
     </w:p>
     <w:p>
@@ -1410,7 +1344,7 @@
 </file>
 
 <file path=word/numbering.xml><?xml version="1.0" encoding="utf-8"?>
-<w:numbering xmlns:wpc="http://schemas.microsoft.com/office/word/2010/wordprocessingCanvas" xmlns:cx="http://schemas.microsoft.com/office/drawing/2014/chartex" xmlns:cx1="http://schemas.microsoft.com/office/drawing/2015/9/8/chartex" xmlns:cx2="http://schemas.microsoft.com/office/drawing/2015/10/21/chartex" xmlns:cx3="http://schemas.microsoft.com/office/drawing/2016/5/9/chartex" xmlns:cx4="http://schemas.microsoft.com/office/drawing/2016/5/10/chartex" xmlns:cx5="http://schemas.microsoft.com/office/drawing/2016/5/11/chartex" xmlns:cx6="http://schemas.microsoft.com/office/drawing/2016/5/12/chartex" xmlns:cx7="http://schemas.microsoft.com/office/drawing/2016/5/13/chartex" xmlns:cx8="http://schemas.microsoft.com/office/drawing/2016/5/14/chartex" xmlns:mc="http://schemas.openxmlformats.org/markup-compatibility/2006" xmlns:aink="http://schemas.microsoft.com/office/drawing/2016/ink" xmlns:am3d="http://schemas.microsoft.com/office/drawing/2017/model3d" xmlns:o="urn:schemas-microsoft-com:office:office" xmlns:r="http://schemas.openxmlformats.org/officeDocument/2006/relationships" xmlns:m="http://schemas.openxmlformats.org/officeDocument/2006/math" xmlns:v="urn:schemas-microsoft-com:vml" xmlns:wp14="http://schemas.microsoft.com/office/word/2010/wordprocessingDrawing" xmlns:wp="http://schemas.openxmlformats.org/drawingml/2006/wordprocessingDrawing" xmlns:w10="urn:schemas-microsoft-com:office:word" xmlns:w="http://schemas.openxmlformats.org/wordprocessingml/2006/main" xmlns:w14="http://schemas.microsoft.com/office/word/2010/wordml" xmlns:w15="http://schemas.microsoft.com/office/word/2012/wordml" xmlns:w16cid="http://schemas.microsoft.com/office/word/2016/wordml/cid" xmlns:w16se="http://schemas.microsoft.com/office/word/2015/wordml/symex" xmlns:wpg="http://schemas.microsoft.com/office/word/2010/wordprocessingGroup" xmlns:wpi="http://schemas.microsoft.com/office/word/2010/wordprocessingInk" xmlns:wne="http://schemas.microsoft.com/office/word/2006/wordml" xmlns:wps="http://schemas.microsoft.com/office/word/2010/wordprocessingShape" mc:Ignorable="w14 w15 w16se w16cid wp14">
+<w:numbering xmlns:wpc="http://schemas.microsoft.com/office/word/2010/wordprocessingCanvas" xmlns:cx="http://schemas.microsoft.com/office/drawing/2014/chartex" xmlns:cx1="http://schemas.microsoft.com/office/drawing/2015/9/8/chartex" xmlns:cx2="http://schemas.microsoft.com/office/drawing/2015/10/21/chartex" xmlns:cx3="http://schemas.microsoft.com/office/drawing/2016/5/9/chartex" xmlns:cx4="http://schemas.microsoft.com/office/drawing/2016/5/10/chartex" xmlns:cx5="http://schemas.microsoft.com/office/drawing/2016/5/11/chartex" xmlns:cx6="http://schemas.microsoft.com/office/drawing/2016/5/12/chartex" xmlns:cx7="http://schemas.microsoft.com/office/drawing/2016/5/13/chartex" xmlns:cx8="http://schemas.microsoft.com/office/drawing/2016/5/14/chartex" xmlns:mc="http://schemas.openxmlformats.org/markup-compatibility/2006" xmlns:aink="http://schemas.microsoft.com/office/drawing/2016/ink" xmlns:am3d="http://schemas.microsoft.com/office/drawing/2017/model3d" xmlns:o="urn:schemas-microsoft-com:office:office" xmlns:oel="http://schemas.microsoft.com/office/2019/extlst" xmlns:r="http://schemas.openxmlformats.org/officeDocument/2006/relationships" xmlns:m="http://schemas.openxmlformats.org/officeDocument/2006/math" xmlns:v="urn:schemas-microsoft-com:vml" xmlns:wp14="http://schemas.microsoft.com/office/word/2010/wordprocessingDrawing" xmlns:wp="http://schemas.openxmlformats.org/drawingml/2006/wordprocessingDrawing" xmlns:w10="urn:schemas-microsoft-com:office:word" xmlns:w="http://schemas.openxmlformats.org/wordprocessingml/2006/main" xmlns:w14="http://schemas.microsoft.com/office/word/2010/wordml" xmlns:w15="http://schemas.microsoft.com/office/word/2012/wordml" xmlns:w16cex="http://schemas.microsoft.com/office/word/2018/wordml/cex" xmlns:w16cid="http://schemas.microsoft.com/office/word/2016/wordml/cid" xmlns:w16="http://schemas.microsoft.com/office/word/2018/wordml" xmlns:w16du="http://schemas.microsoft.com/office/word/2023/wordml/word16du" xmlns:w16sdtdh="http://schemas.microsoft.com/office/word/2020/wordml/sdtdatahash" xmlns:w16sdtfl="http://schemas.microsoft.com/office/word/2024/wordml/sdtformatlock" xmlns:w16se="http://schemas.microsoft.com/office/word/2015/wordml/symex" xmlns:wpg="http://schemas.microsoft.com/office/word/2010/wordprocessingGroup" xmlns:wpi="http://schemas.microsoft.com/office/word/2010/wordprocessingInk" xmlns:wne="http://schemas.microsoft.com/office/word/2006/wordml" xmlns:wps="http://schemas.microsoft.com/office/word/2010/wordprocessingShape" mc:Ignorable="w14 w15 w16se w16cid w16 w16cex w16sdtdh w16sdtfl w16du wp14">
   <w:abstractNum w:abstractNumId="0" w15:restartNumberingAfterBreak="0">
     <w:nsid w:val="4FCA4A00"/>
     <w:multiLevelType w:val="hybridMultilevel"/>
@@ -1497,14 +1431,14 @@
       </w:pPr>
     </w:lvl>
   </w:abstractNum>
-  <w:num w:numId="1">
+  <w:num w:numId="1" w16cid:durableId="1600748272">
     <w:abstractNumId w:val="0"/>
   </w:num>
 </w:numbering>
 </file>
 
 <file path=word/styles.xml><?xml version="1.0" encoding="utf-8"?>
-<w:styles xmlns:mc="http://schemas.openxmlformats.org/markup-compatibility/2006" xmlns:r="http://schemas.openxmlformats.org/officeDocument/2006/relationships" xmlns:w="http://schemas.openxmlformats.org/wordprocessingml/2006/main" xmlns:w14="http://schemas.microsoft.com/office/word/2010/wordml" xmlns:w15="http://schemas.microsoft.com/office/word/2012/wordml" xmlns:w16cid="http://schemas.microsoft.com/office/word/2016/wordml/cid" xmlns:w16se="http://schemas.microsoft.com/office/word/2015/wordml/symex" mc:Ignorable="w14 w15 w16se w16cid">
+<w:styles xmlns:mc="http://schemas.openxmlformats.org/markup-compatibility/2006" xmlns:r="http://schemas.openxmlformats.org/officeDocument/2006/relationships" xmlns:w="http://schemas.openxmlformats.org/wordprocessingml/2006/main" xmlns:w14="http://schemas.microsoft.com/office/word/2010/wordml" xmlns:w15="http://schemas.microsoft.com/office/word/2012/wordml" xmlns:w16cex="http://schemas.microsoft.com/office/word/2018/wordml/cex" xmlns:w16cid="http://schemas.microsoft.com/office/word/2016/wordml/cid" xmlns:w16="http://schemas.microsoft.com/office/word/2018/wordml" xmlns:w16du="http://schemas.microsoft.com/office/word/2023/wordml/word16du" xmlns:w16sdtdh="http://schemas.microsoft.com/office/word/2020/wordml/sdtdatahash" xmlns:w16sdtfl="http://schemas.microsoft.com/office/word/2024/wordml/sdtformatlock" xmlns:w16se="http://schemas.microsoft.com/office/word/2015/wordml/symex" mc:Ignorable="w14 w15 w16se w16cid w16 w16cex w16sdtdh w16sdtfl w16du">
   <w:docDefaults>
     <w:rPrDefault>
       <w:rPr>
@@ -1520,7 +1454,7 @@
       </w:pPr>
     </w:pPrDefault>
   </w:docDefaults>
-  <w:latentStyles w:defLockedState="0" w:defUIPriority="99" w:defSemiHidden="0" w:defUnhideWhenUsed="0" w:defQFormat="0" w:count="375">
+  <w:latentStyles w:defLockedState="0" w:defUIPriority="99" w:defSemiHidden="0" w:defUnhideWhenUsed="0" w:defQFormat="0" w:count="376">
     <w:lsdException w:name="Normal" w:uiPriority="0" w:qFormat="1"/>
     <w:lsdException w:name="heading 1" w:uiPriority="9" w:qFormat="1"/>
     <w:lsdException w:name="heading 2" w:semiHidden="1" w:uiPriority="9" w:unhideWhenUsed="1" w:qFormat="1"/>
@@ -1896,6 +1830,7 @@
     <w:lsdException w:name="Smart Hyperlink" w:semiHidden="1" w:unhideWhenUsed="1"/>
     <w:lsdException w:name="Hashtag" w:semiHidden="1" w:unhideWhenUsed="1"/>
     <w:lsdException w:name="Unresolved Mention" w:semiHidden="1" w:unhideWhenUsed="1"/>
+    <w:lsdException w:name="Smart Link" w:semiHidden="1" w:unhideWhenUsed="1"/>
   </w:latentStyles>
   <w:style w:type="paragraph" w:default="1" w:styleId="Normal">
     <w:name w:val="Normal"/>
@@ -2407,23 +2342,6 @@
 </file>
 
 <file path=customXml/item1.xml><?xml version="1.0" encoding="utf-8"?>
-<p:properties xmlns:p="http://schemas.microsoft.com/office/2006/metadata/properties" xmlns:xsi="http://www.w3.org/2001/XMLSchema-instance" xmlns:pc="http://schemas.microsoft.com/office/infopath/2007/PartnerControls">
-  <documentManagement>
-    <_activity xmlns="4eb9130b-9435-48d9-b87d-905941a3cab1" xsi:nil="true"/>
-  </documentManagement>
-</p:properties>
-</file>
-
-<file path=customXml/item2.xml><?xml version="1.0" encoding="utf-8"?>
-<?mso-contentType ?>
-<FormTemplates xmlns="http://schemas.microsoft.com/sharepoint/v3/contenttype/forms">
-  <Display>DocumentLibraryForm</Display>
-  <Edit>DocumentLibraryForm</Edit>
-  <New>DocumentLibraryForm</New>
-</FormTemplates>
-</file>
-
-<file path=customXml/item3.xml><?xml version="1.0" encoding="utf-8"?>
 <ct:contentTypeSchema xmlns:ct="http://schemas.microsoft.com/office/2006/metadata/contentType" xmlns:ma="http://schemas.microsoft.com/office/2006/metadata/properties/metaAttributes" ct:_="" ma:_="" ma:contentTypeName="Document" ma:contentTypeID="0x0101000502838957C6564BB46506DEC63665BB" ma:contentTypeVersion="17" ma:contentTypeDescription="Create a new document." ma:contentTypeScope="" ma:versionID="9de721930635956eac350533ec31bc30">
   <xsd:schema xmlns:xsd="http://www.w3.org/2001/XMLSchema" xmlns:xs="http://www.w3.org/2001/XMLSchema" xmlns:p="http://schemas.microsoft.com/office/2006/metadata/properties" xmlns:ns3="4eb9130b-9435-48d9-b87d-905941a3cab1" xmlns:ns4="e1a6b317-3158-47d5-a002-ac34399186ce" targetNamespace="http://schemas.microsoft.com/office/2006/metadata/properties" ma:root="true" ma:fieldsID="06d7b2c3b30fb0b79060831e4e3de977" ns3:_="" ns4:_="">
     <xsd:import namespace="4eb9130b-9435-48d9-b87d-905941a3cab1"/>
@@ -2670,32 +2588,24 @@
 </ct:contentTypeSchema>
 </file>
 
-<file path=customXml/itemProps1.xml><?xml version="1.0" encoding="utf-8"?>
-<ds:datastoreItem xmlns:ds="http://schemas.openxmlformats.org/officeDocument/2006/customXml" ds:itemID="{6CB2E35B-C396-4B31-9F3F-6A78472F0C04}">
-  <ds:schemaRefs>
-    <ds:schemaRef ds:uri="http://schemas.microsoft.com/office/2006/documentManagement/types"/>
-    <ds:schemaRef ds:uri="http://schemas.microsoft.com/office/infopath/2007/PartnerControls"/>
-    <ds:schemaRef ds:uri="http://purl.org/dc/elements/1.1/"/>
-    <ds:schemaRef ds:uri="http://schemas.microsoft.com/office/2006/metadata/properties"/>
-    <ds:schemaRef ds:uri="e1a6b317-3158-47d5-a002-ac34399186ce"/>
-    <ds:schemaRef ds:uri="4eb9130b-9435-48d9-b87d-905941a3cab1"/>
-    <ds:schemaRef ds:uri="http://purl.org/dc/terms/"/>
-    <ds:schemaRef ds:uri="http://schemas.openxmlformats.org/package/2006/metadata/core-properties"/>
-    <ds:schemaRef ds:uri="http://www.w3.org/XML/1998/namespace"/>
-    <ds:schemaRef ds:uri="http://purl.org/dc/dcmitype/"/>
-  </ds:schemaRefs>
-</ds:datastoreItem>
+<file path=customXml/item2.xml><?xml version="1.0" encoding="utf-8"?>
+<?mso-contentType ?>
+<FormTemplates xmlns="http://schemas.microsoft.com/sharepoint/v3/contenttype/forms">
+  <Display>DocumentLibraryForm</Display>
+  <Edit>DocumentLibraryForm</Edit>
+  <New>DocumentLibraryForm</New>
+</FormTemplates>
 </file>
 
-<file path=customXml/itemProps2.xml><?xml version="1.0" encoding="utf-8"?>
-<ds:datastoreItem xmlns:ds="http://schemas.openxmlformats.org/officeDocument/2006/customXml" ds:itemID="{2BBA2231-6BEE-4D73-B372-CB8CFC269061}">
-  <ds:schemaRefs>
-    <ds:schemaRef ds:uri="http://schemas.microsoft.com/sharepoint/v3/contenttype/forms"/>
-  </ds:schemaRefs>
-</ds:datastoreItem>
+<file path=customXml/item3.xml><?xml version="1.0" encoding="utf-8"?>
+<p:properties xmlns:p="http://schemas.microsoft.com/office/2006/metadata/properties" xmlns:xsi="http://www.w3.org/2001/XMLSchema-instance" xmlns:pc="http://schemas.microsoft.com/office/infopath/2007/PartnerControls">
+  <documentManagement>
+    <_activity xmlns="4eb9130b-9435-48d9-b87d-905941a3cab1" xsi:nil="true"/>
+  </documentManagement>
+</p:properties>
 </file>
 
-<file path=customXml/itemProps3.xml><?xml version="1.0" encoding="utf-8"?>
+<file path=customXml/itemProps1.xml><?xml version="1.0" encoding="utf-8"?>
 <ds:datastoreItem xmlns:ds="http://schemas.openxmlformats.org/officeDocument/2006/customXml" ds:itemID="{6F97BB9D-21AA-4E87-8B7D-B67E3238F4C4}">
   <ds:schemaRefs>
     <ds:schemaRef ds:uri="http://schemas.microsoft.com/office/2006/metadata/contentType"/>
@@ -2712,4 +2622,22 @@
     <ds:schemaRef ds:uri="http://schemas.microsoft.com/internal/obd"/>
   </ds:schemaRefs>
 </ds:datastoreItem>
+</file>
+
+<file path=customXml/itemProps2.xml><?xml version="1.0" encoding="utf-8"?>
+<ds:datastoreItem xmlns:ds="http://schemas.openxmlformats.org/officeDocument/2006/customXml" ds:itemID="{2BBA2231-6BEE-4D73-B372-CB8CFC269061}">
+  <ds:schemaRefs>
+    <ds:schemaRef ds:uri="http://schemas.microsoft.com/sharepoint/v3/contenttype/forms"/>
+  </ds:schemaRefs>
+</ds:datastoreItem>
+</file>
+
+<file path=customXml/itemProps3.xml><?xml version="1.0" encoding="utf-8"?>
+<ds:datastoreItem xmlns:ds="http://schemas.openxmlformats.org/officeDocument/2006/customXml" ds:itemID="{6CB2E35B-C396-4B31-9F3F-6A78472F0C04}">
+  <ds:schemaRefs>
+    <ds:schemaRef ds:uri="http://schemas.microsoft.com/office/2006/metadata/properties"/>
+    <ds:schemaRef ds:uri="http://schemas.microsoft.com/office/infopath/2007/PartnerControls"/>
+    <ds:schemaRef ds:uri="4eb9130b-9435-48d9-b87d-905941a3cab1"/>
+  </ds:schemaRefs>
+</ds:datastoreItem>
 </file>
</xml_diff>

<commit_message>
Interactives Setup and Animation imports
</commit_message>
<xml_diff>
--- a/Environmental Animation Template Instructions.docx
+++ b/Environmental Animation Template Instructions.docx
@@ -2342,6 +2342,23 @@
 </file>
 
 <file path=customXml/item1.xml><?xml version="1.0" encoding="utf-8"?>
+<p:properties xmlns:p="http://schemas.microsoft.com/office/2006/metadata/properties" xmlns:xsi="http://www.w3.org/2001/XMLSchema-instance" xmlns:pc="http://schemas.microsoft.com/office/infopath/2007/PartnerControls">
+  <documentManagement>
+    <_activity xmlns="4eb9130b-9435-48d9-b87d-905941a3cab1" xsi:nil="true"/>
+  </documentManagement>
+</p:properties>
+</file>
+
+<file path=customXml/item2.xml><?xml version="1.0" encoding="utf-8"?>
+<?mso-contentType ?>
+<FormTemplates xmlns="http://schemas.microsoft.com/sharepoint/v3/contenttype/forms">
+  <Display>DocumentLibraryForm</Display>
+  <Edit>DocumentLibraryForm</Edit>
+  <New>DocumentLibraryForm</New>
+</FormTemplates>
+</file>
+
+<file path=customXml/item3.xml><?xml version="1.0" encoding="utf-8"?>
 <ct:contentTypeSchema xmlns:ct="http://schemas.microsoft.com/office/2006/metadata/contentType" xmlns:ma="http://schemas.microsoft.com/office/2006/metadata/properties/metaAttributes" ct:_="" ma:_="" ma:contentTypeName="Document" ma:contentTypeID="0x0101000502838957C6564BB46506DEC63665BB" ma:contentTypeVersion="17" ma:contentTypeDescription="Create a new document." ma:contentTypeScope="" ma:versionID="9de721930635956eac350533ec31bc30">
   <xsd:schema xmlns:xsd="http://www.w3.org/2001/XMLSchema" xmlns:xs="http://www.w3.org/2001/XMLSchema" xmlns:p="http://schemas.microsoft.com/office/2006/metadata/properties" xmlns:ns3="4eb9130b-9435-48d9-b87d-905941a3cab1" xmlns:ns4="e1a6b317-3158-47d5-a002-ac34399186ce" targetNamespace="http://schemas.microsoft.com/office/2006/metadata/properties" ma:root="true" ma:fieldsID="06d7b2c3b30fb0b79060831e4e3de977" ns3:_="" ns4:_="">
     <xsd:import namespace="4eb9130b-9435-48d9-b87d-905941a3cab1"/>
@@ -2588,24 +2605,25 @@
 </ct:contentTypeSchema>
 </file>
 
-<file path=customXml/item2.xml><?xml version="1.0" encoding="utf-8"?>
-<?mso-contentType ?>
-<FormTemplates xmlns="http://schemas.microsoft.com/sharepoint/v3/contenttype/forms">
-  <Display>DocumentLibraryForm</Display>
-  <Edit>DocumentLibraryForm</Edit>
-  <New>DocumentLibraryForm</New>
-</FormTemplates>
+<file path=customXml/itemProps1.xml><?xml version="1.0" encoding="utf-8"?>
+<ds:datastoreItem xmlns:ds="http://schemas.openxmlformats.org/officeDocument/2006/customXml" ds:itemID="{6CB2E35B-C396-4B31-9F3F-6A78472F0C04}">
+  <ds:schemaRefs>
+    <ds:schemaRef ds:uri="http://schemas.microsoft.com/office/2006/metadata/properties"/>
+    <ds:schemaRef ds:uri="http://schemas.microsoft.com/office/infopath/2007/PartnerControls"/>
+    <ds:schemaRef ds:uri="4eb9130b-9435-48d9-b87d-905941a3cab1"/>
+  </ds:schemaRefs>
+</ds:datastoreItem>
 </file>
 
-<file path=customXml/item3.xml><?xml version="1.0" encoding="utf-8"?>
-<p:properties xmlns:p="http://schemas.microsoft.com/office/2006/metadata/properties" xmlns:xsi="http://www.w3.org/2001/XMLSchema-instance" xmlns:pc="http://schemas.microsoft.com/office/infopath/2007/PartnerControls">
-  <documentManagement>
-    <_activity xmlns="4eb9130b-9435-48d9-b87d-905941a3cab1" xsi:nil="true"/>
-  </documentManagement>
-</p:properties>
+<file path=customXml/itemProps2.xml><?xml version="1.0" encoding="utf-8"?>
+<ds:datastoreItem xmlns:ds="http://schemas.openxmlformats.org/officeDocument/2006/customXml" ds:itemID="{2BBA2231-6BEE-4D73-B372-CB8CFC269061}">
+  <ds:schemaRefs>
+    <ds:schemaRef ds:uri="http://schemas.microsoft.com/sharepoint/v3/contenttype/forms"/>
+  </ds:schemaRefs>
+</ds:datastoreItem>
 </file>
 
-<file path=customXml/itemProps1.xml><?xml version="1.0" encoding="utf-8"?>
+<file path=customXml/itemProps3.xml><?xml version="1.0" encoding="utf-8"?>
 <ds:datastoreItem xmlns:ds="http://schemas.openxmlformats.org/officeDocument/2006/customXml" ds:itemID="{6F97BB9D-21AA-4E87-8B7D-B67E3238F4C4}">
   <ds:schemaRefs>
     <ds:schemaRef ds:uri="http://schemas.microsoft.com/office/2006/metadata/contentType"/>
@@ -2622,22 +2640,4 @@
     <ds:schemaRef ds:uri="http://schemas.microsoft.com/internal/obd"/>
   </ds:schemaRefs>
 </ds:datastoreItem>
-</file>
-
-<file path=customXml/itemProps2.xml><?xml version="1.0" encoding="utf-8"?>
-<ds:datastoreItem xmlns:ds="http://schemas.openxmlformats.org/officeDocument/2006/customXml" ds:itemID="{2BBA2231-6BEE-4D73-B372-CB8CFC269061}">
-  <ds:schemaRefs>
-    <ds:schemaRef ds:uri="http://schemas.microsoft.com/sharepoint/v3/contenttype/forms"/>
-  </ds:schemaRefs>
-</ds:datastoreItem>
-</file>
-
-<file path=customXml/itemProps3.xml><?xml version="1.0" encoding="utf-8"?>
-<ds:datastoreItem xmlns:ds="http://schemas.openxmlformats.org/officeDocument/2006/customXml" ds:itemID="{6CB2E35B-C396-4B31-9F3F-6A78472F0C04}">
-  <ds:schemaRefs>
-    <ds:schemaRef ds:uri="http://schemas.microsoft.com/office/2006/metadata/properties"/>
-    <ds:schemaRef ds:uri="http://schemas.microsoft.com/office/infopath/2007/PartnerControls"/>
-    <ds:schemaRef ds:uri="4eb9130b-9435-48d9-b87d-905941a3cab1"/>
-  </ds:schemaRefs>
-</ds:datastoreItem>
 </file>
</xml_diff>

<commit_message>
Revert "Merge pull request #20 from Lanaa44/Jamie_Branch"
This reverts commit fb777d7752a942d84defba9683025b4f4598e5d3, reversing
changes made to 5f542fd5a49bc4874c6947a170c12855d37b4778.
</commit_message>
<xml_diff>
--- a/Environmental Animation Template Instructions.docx
+++ b/Environmental Animation Template Instructions.docx
@@ -1,11 +1,13 @@
 
 <file path=word/document.xml><?xml version="1.0" encoding="utf-8"?>
-<w:document xmlns:wpc="http://schemas.microsoft.com/office/word/2010/wordprocessingCanvas" xmlns:cx="http://schemas.microsoft.com/office/drawing/2014/chartex" xmlns:cx1="http://schemas.microsoft.com/office/drawing/2015/9/8/chartex" xmlns:cx2="http://schemas.microsoft.com/office/drawing/2015/10/21/chartex" xmlns:cx3="http://schemas.microsoft.com/office/drawing/2016/5/9/chartex" xmlns:cx4="http://schemas.microsoft.com/office/drawing/2016/5/10/chartex" xmlns:cx5="http://schemas.microsoft.com/office/drawing/2016/5/11/chartex" xmlns:cx6="http://schemas.microsoft.com/office/drawing/2016/5/12/chartex" xmlns:cx7="http://schemas.microsoft.com/office/drawing/2016/5/13/chartex" xmlns:cx8="http://schemas.microsoft.com/office/drawing/2016/5/14/chartex" xmlns:mc="http://schemas.openxmlformats.org/markup-compatibility/2006" xmlns:aink="http://schemas.microsoft.com/office/drawing/2016/ink" xmlns:am3d="http://schemas.microsoft.com/office/drawing/2017/model3d" xmlns:o="urn:schemas-microsoft-com:office:office" xmlns:oel="http://schemas.microsoft.com/office/2019/extlst" xmlns:r="http://schemas.openxmlformats.org/officeDocument/2006/relationships" xmlns:m="http://schemas.openxmlformats.org/officeDocument/2006/math" xmlns:v="urn:schemas-microsoft-com:vml" xmlns:wp14="http://schemas.microsoft.com/office/word/2010/wordprocessingDrawing" xmlns:wp="http://schemas.openxmlformats.org/drawingml/2006/wordprocessingDrawing" xmlns:w10="urn:schemas-microsoft-com:office:word" xmlns:w="http://schemas.openxmlformats.org/wordprocessingml/2006/main" xmlns:w14="http://schemas.microsoft.com/office/word/2010/wordml" xmlns:w15="http://schemas.microsoft.com/office/word/2012/wordml" xmlns:w16cex="http://schemas.microsoft.com/office/word/2018/wordml/cex" xmlns:w16cid="http://schemas.microsoft.com/office/word/2016/wordml/cid" xmlns:w16="http://schemas.microsoft.com/office/word/2018/wordml" xmlns:w16du="http://schemas.microsoft.com/office/word/2023/wordml/word16du" xmlns:w16sdtdh="http://schemas.microsoft.com/office/word/2020/wordml/sdtdatahash" xmlns:w16sdtfl="http://schemas.microsoft.com/office/word/2024/wordml/sdtformatlock" xmlns:w16se="http://schemas.microsoft.com/office/word/2015/wordml/symex" xmlns:wpg="http://schemas.microsoft.com/office/word/2010/wordprocessingGroup" xmlns:wpi="http://schemas.microsoft.com/office/word/2010/wordprocessingInk" xmlns:wne="http://schemas.microsoft.com/office/word/2006/wordml" xmlns:wps="http://schemas.microsoft.com/office/word/2010/wordprocessingShape" mc:Ignorable="w14 w15 w16se w16cid w16 w16cex w16sdtdh w16sdtfl w16du wp14">
+<w:document xmlns:wpc="http://schemas.microsoft.com/office/word/2010/wordprocessingCanvas" xmlns:cx="http://schemas.microsoft.com/office/drawing/2014/chartex" xmlns:cx1="http://schemas.microsoft.com/office/drawing/2015/9/8/chartex" xmlns:cx2="http://schemas.microsoft.com/office/drawing/2015/10/21/chartex" xmlns:cx3="http://schemas.microsoft.com/office/drawing/2016/5/9/chartex" xmlns:cx4="http://schemas.microsoft.com/office/drawing/2016/5/10/chartex" xmlns:cx5="http://schemas.microsoft.com/office/drawing/2016/5/11/chartex" xmlns:cx6="http://schemas.microsoft.com/office/drawing/2016/5/12/chartex" xmlns:cx7="http://schemas.microsoft.com/office/drawing/2016/5/13/chartex" xmlns:cx8="http://schemas.microsoft.com/office/drawing/2016/5/14/chartex" xmlns:mc="http://schemas.openxmlformats.org/markup-compatibility/2006" xmlns:aink="http://schemas.microsoft.com/office/drawing/2016/ink" xmlns:am3d="http://schemas.microsoft.com/office/drawing/2017/model3d" xmlns:o="urn:schemas-microsoft-com:office:office" xmlns:r="http://schemas.openxmlformats.org/officeDocument/2006/relationships" xmlns:m="http://schemas.openxmlformats.org/officeDocument/2006/math" xmlns:v="urn:schemas-microsoft-com:vml" xmlns:wp14="http://schemas.microsoft.com/office/word/2010/wordprocessingDrawing" xmlns:wp="http://schemas.openxmlformats.org/drawingml/2006/wordprocessingDrawing" xmlns:w10="urn:schemas-microsoft-com:office:word" xmlns:w="http://schemas.openxmlformats.org/wordprocessingml/2006/main" xmlns:w14="http://schemas.microsoft.com/office/word/2010/wordml" xmlns:w15="http://schemas.microsoft.com/office/word/2012/wordml" xmlns:w16cid="http://schemas.microsoft.com/office/word/2016/wordml/cid" xmlns:w16se="http://schemas.microsoft.com/office/word/2015/wordml/symex" xmlns:wpg="http://schemas.microsoft.com/office/word/2010/wordprocessingGroup" xmlns:wpi="http://schemas.microsoft.com/office/word/2010/wordprocessingInk" xmlns:wne="http://schemas.microsoft.com/office/word/2006/wordml" xmlns:wps="http://schemas.microsoft.com/office/word/2010/wordprocessingShape" mc:Ignorable="w14 w15 w16se w16cid wp14">
   <w:body>
     <w:p>
       <w:pPr>
         <w:pStyle w:val="Title"/>
       </w:pPr>
+      <w:bookmarkStart w:id="0" w:name="_GoBack"/>
+      <w:bookmarkEnd w:id="0"/>
       <w:r>
         <w:t>Environmental Animation Template</w:t>
       </w:r>
@@ -739,7 +741,23 @@
     </w:p>
     <w:p>
       <w:r>
-        <w:t xml:space="preserve">The Animation Blueprint consists of two parts: the Event Graph, which holds the logic used to capture and calculate values, and the Anim Graph, which holds the state machines, players and blend nodes used to calculate the final pose. Both are layered in the middle of the screen, accessible by tabs. The left side of the screen includes a preview of the output, an overview of all functions and graphs, and a container for </w:t>
+        <w:t xml:space="preserve">The Animation Blueprint consists of two parts: </w:t>
+      </w:r>
+      <w:proofErr w:type="gramStart"/>
+      <w:r>
+        <w:t>the</w:t>
+      </w:r>
+      <w:proofErr w:type="gramEnd"/>
+      <w:r>
+        <w:t xml:space="preserve"> Event Graph, which holds the logic used to capture and calculate values, and the </w:t>
+      </w:r>
+      <w:proofErr w:type="spellStart"/>
+      <w:r>
+        <w:t>Anim</w:t>
+      </w:r>
+      <w:proofErr w:type="spellEnd"/>
+      <w:r>
+        <w:t xml:space="preserve"> Graph, which holds the state machines, players and blend nodes used to calculate the final pose. Both are layered in the middle of the screen, accessible by tabs. The left side of the screen includes a preview of the output, an overview of all functions and graphs, and a container for </w:t>
       </w:r>
       <w:r>
         <w:rPr>
@@ -748,7 +766,15 @@
         <w:t>variables</w:t>
       </w:r>
       <w:r>
-        <w:t xml:space="preserve"> – the calculated values from the Event Graph that will be applied to the Anim Graph.</w:t>
+        <w:t xml:space="preserve"> – the calculated values from the Event Graph that will be applied to the </w:t>
+      </w:r>
+      <w:proofErr w:type="spellStart"/>
+      <w:r>
+        <w:t>Anim</w:t>
+      </w:r>
+      <w:proofErr w:type="spellEnd"/>
+      <w:r>
+        <w:t xml:space="preserve"> Graph.</w:t>
       </w:r>
     </w:p>
     <w:p>
@@ -913,7 +939,15 @@
     </w:p>
     <w:p>
       <w:r>
-        <w:t>Now move to the Anim Graph. You should see a node with a running character on it marked “Output Pose”. This graph works similarly to the Event Graph, but instead of triggers and functions, it uses Animation Players, State Machines and Blend Nodes, together with variables from the Event Graph, to calculate the final pose for the character within each frame.</w:t>
+        <w:t xml:space="preserve">Now move to the </w:t>
+      </w:r>
+      <w:proofErr w:type="spellStart"/>
+      <w:r>
+        <w:t>Anim</w:t>
+      </w:r>
+      <w:proofErr w:type="spellEnd"/>
+      <w:r>
+        <w:t xml:space="preserve"> Graph. You should see a node with a running character on it marked “Output Pose”. This graph works similarly to the Event Graph, but instead of triggers and functions, it uses Animation Players, State Machines and Blend Nodes, together with variables from the Event Graph, to calculate the final pose for the character within each frame.</w:t>
       </w:r>
     </w:p>
     <w:p>
@@ -939,7 +973,15 @@
       </w:r>
       <w:proofErr w:type="spellEnd"/>
       <w:r>
-        <w:t xml:space="preserve"> you made earlier, and drag it onto the Anim Graph (be sure to leave </w:t>
+        <w:t xml:space="preserve"> you made earlier, and drag it onto the </w:t>
+      </w:r>
+      <w:proofErr w:type="spellStart"/>
+      <w:r>
+        <w:t>Anim</w:t>
+      </w:r>
+      <w:proofErr w:type="spellEnd"/>
+      <w:r>
+        <w:t xml:space="preserve"> Graph (be sure to leave </w:t>
       </w:r>
       <w:r>
         <w:rPr>
@@ -970,15 +1012,15 @@
       </w:r>
       <w:proofErr w:type="spellEnd"/>
       <w:r>
-        <w:t xml:space="preserve">. Then drag out from the variable pin on the right hand </w:t>
+        <w:t xml:space="preserve">. Then drag out from the variable pin on the </w:t>
       </w:r>
       <w:proofErr w:type="gramStart"/>
       <w:r>
-        <w:t>side, and</w:t>
+        <w:t>right hand</w:t>
       </w:r>
       <w:proofErr w:type="gramEnd"/>
       <w:r>
-        <w:t xml:space="preserve"> drop it onto the “speed” connection on the left-hand side of the </w:t>
+        <w:t xml:space="preserve"> side, and drop it onto the “speed” connection on the left-hand side of the </w:t>
       </w:r>
       <w:proofErr w:type="spellStart"/>
       <w:r>
@@ -1000,7 +1042,15 @@
         <w:t>not</w:t>
       </w:r>
       <w:r>
-        <w:t xml:space="preserve"> included in the Anim Graph. Drag the “pose” pin from the </w:t>
+        <w:t xml:space="preserve"> included in the </w:t>
+      </w:r>
+      <w:proofErr w:type="spellStart"/>
+      <w:r>
+        <w:t>Anim</w:t>
+      </w:r>
+      <w:proofErr w:type="spellEnd"/>
+      <w:r>
+        <w:t xml:space="preserve"> Graph. Drag the “pose” pin from the </w:t>
       </w:r>
       <w:proofErr w:type="spellStart"/>
       <w:r>
@@ -1155,7 +1205,23 @@
     </w:p>
     <w:p>
       <w:r>
-        <w:t>Above this, under “Anim”, set the “Anim Class” to the Animation Blueprint you created.</w:t>
+        <w:t>Above this, under “</w:t>
+      </w:r>
+      <w:proofErr w:type="spellStart"/>
+      <w:r>
+        <w:t>Anim</w:t>
+      </w:r>
+      <w:proofErr w:type="spellEnd"/>
+      <w:r>
+        <w:t>”, set the “</w:t>
+      </w:r>
+      <w:proofErr w:type="spellStart"/>
+      <w:r>
+        <w:t>Anim</w:t>
+      </w:r>
+      <w:proofErr w:type="spellEnd"/>
+      <w:r>
+        <w:t xml:space="preserve"> Class” to the Animation Blueprint you created.</w:t>
       </w:r>
     </w:p>
     <w:p>
@@ -1344,7 +1410,7 @@
 </file>
 
 <file path=word/numbering.xml><?xml version="1.0" encoding="utf-8"?>
-<w:numbering xmlns:wpc="http://schemas.microsoft.com/office/word/2010/wordprocessingCanvas" xmlns:cx="http://schemas.microsoft.com/office/drawing/2014/chartex" xmlns:cx1="http://schemas.microsoft.com/office/drawing/2015/9/8/chartex" xmlns:cx2="http://schemas.microsoft.com/office/drawing/2015/10/21/chartex" xmlns:cx3="http://schemas.microsoft.com/office/drawing/2016/5/9/chartex" xmlns:cx4="http://schemas.microsoft.com/office/drawing/2016/5/10/chartex" xmlns:cx5="http://schemas.microsoft.com/office/drawing/2016/5/11/chartex" xmlns:cx6="http://schemas.microsoft.com/office/drawing/2016/5/12/chartex" xmlns:cx7="http://schemas.microsoft.com/office/drawing/2016/5/13/chartex" xmlns:cx8="http://schemas.microsoft.com/office/drawing/2016/5/14/chartex" xmlns:mc="http://schemas.openxmlformats.org/markup-compatibility/2006" xmlns:aink="http://schemas.microsoft.com/office/drawing/2016/ink" xmlns:am3d="http://schemas.microsoft.com/office/drawing/2017/model3d" xmlns:o="urn:schemas-microsoft-com:office:office" xmlns:oel="http://schemas.microsoft.com/office/2019/extlst" xmlns:r="http://schemas.openxmlformats.org/officeDocument/2006/relationships" xmlns:m="http://schemas.openxmlformats.org/officeDocument/2006/math" xmlns:v="urn:schemas-microsoft-com:vml" xmlns:wp14="http://schemas.microsoft.com/office/word/2010/wordprocessingDrawing" xmlns:wp="http://schemas.openxmlformats.org/drawingml/2006/wordprocessingDrawing" xmlns:w10="urn:schemas-microsoft-com:office:word" xmlns:w="http://schemas.openxmlformats.org/wordprocessingml/2006/main" xmlns:w14="http://schemas.microsoft.com/office/word/2010/wordml" xmlns:w15="http://schemas.microsoft.com/office/word/2012/wordml" xmlns:w16cex="http://schemas.microsoft.com/office/word/2018/wordml/cex" xmlns:w16cid="http://schemas.microsoft.com/office/word/2016/wordml/cid" xmlns:w16="http://schemas.microsoft.com/office/word/2018/wordml" xmlns:w16du="http://schemas.microsoft.com/office/word/2023/wordml/word16du" xmlns:w16sdtdh="http://schemas.microsoft.com/office/word/2020/wordml/sdtdatahash" xmlns:w16sdtfl="http://schemas.microsoft.com/office/word/2024/wordml/sdtformatlock" xmlns:w16se="http://schemas.microsoft.com/office/word/2015/wordml/symex" xmlns:wpg="http://schemas.microsoft.com/office/word/2010/wordprocessingGroup" xmlns:wpi="http://schemas.microsoft.com/office/word/2010/wordprocessingInk" xmlns:wne="http://schemas.microsoft.com/office/word/2006/wordml" xmlns:wps="http://schemas.microsoft.com/office/word/2010/wordprocessingShape" mc:Ignorable="w14 w15 w16se w16cid w16 w16cex w16sdtdh w16sdtfl w16du wp14">
+<w:numbering xmlns:wpc="http://schemas.microsoft.com/office/word/2010/wordprocessingCanvas" xmlns:cx="http://schemas.microsoft.com/office/drawing/2014/chartex" xmlns:cx1="http://schemas.microsoft.com/office/drawing/2015/9/8/chartex" xmlns:cx2="http://schemas.microsoft.com/office/drawing/2015/10/21/chartex" xmlns:cx3="http://schemas.microsoft.com/office/drawing/2016/5/9/chartex" xmlns:cx4="http://schemas.microsoft.com/office/drawing/2016/5/10/chartex" xmlns:cx5="http://schemas.microsoft.com/office/drawing/2016/5/11/chartex" xmlns:cx6="http://schemas.microsoft.com/office/drawing/2016/5/12/chartex" xmlns:cx7="http://schemas.microsoft.com/office/drawing/2016/5/13/chartex" xmlns:cx8="http://schemas.microsoft.com/office/drawing/2016/5/14/chartex" xmlns:mc="http://schemas.openxmlformats.org/markup-compatibility/2006" xmlns:aink="http://schemas.microsoft.com/office/drawing/2016/ink" xmlns:am3d="http://schemas.microsoft.com/office/drawing/2017/model3d" xmlns:o="urn:schemas-microsoft-com:office:office" xmlns:r="http://schemas.openxmlformats.org/officeDocument/2006/relationships" xmlns:m="http://schemas.openxmlformats.org/officeDocument/2006/math" xmlns:v="urn:schemas-microsoft-com:vml" xmlns:wp14="http://schemas.microsoft.com/office/word/2010/wordprocessingDrawing" xmlns:wp="http://schemas.openxmlformats.org/drawingml/2006/wordprocessingDrawing" xmlns:w10="urn:schemas-microsoft-com:office:word" xmlns:w="http://schemas.openxmlformats.org/wordprocessingml/2006/main" xmlns:w14="http://schemas.microsoft.com/office/word/2010/wordml" xmlns:w15="http://schemas.microsoft.com/office/word/2012/wordml" xmlns:w16cid="http://schemas.microsoft.com/office/word/2016/wordml/cid" xmlns:w16se="http://schemas.microsoft.com/office/word/2015/wordml/symex" xmlns:wpg="http://schemas.microsoft.com/office/word/2010/wordprocessingGroup" xmlns:wpi="http://schemas.microsoft.com/office/word/2010/wordprocessingInk" xmlns:wne="http://schemas.microsoft.com/office/word/2006/wordml" xmlns:wps="http://schemas.microsoft.com/office/word/2010/wordprocessingShape" mc:Ignorable="w14 w15 w16se w16cid wp14">
   <w:abstractNum w:abstractNumId="0" w15:restartNumberingAfterBreak="0">
     <w:nsid w:val="4FCA4A00"/>
     <w:multiLevelType w:val="hybridMultilevel"/>
@@ -1431,14 +1497,14 @@
       </w:pPr>
     </w:lvl>
   </w:abstractNum>
-  <w:num w:numId="1" w16cid:durableId="1600748272">
+  <w:num w:numId="1">
     <w:abstractNumId w:val="0"/>
   </w:num>
 </w:numbering>
 </file>
 
 <file path=word/styles.xml><?xml version="1.0" encoding="utf-8"?>
-<w:styles xmlns:mc="http://schemas.openxmlformats.org/markup-compatibility/2006" xmlns:r="http://schemas.openxmlformats.org/officeDocument/2006/relationships" xmlns:w="http://schemas.openxmlformats.org/wordprocessingml/2006/main" xmlns:w14="http://schemas.microsoft.com/office/word/2010/wordml" xmlns:w15="http://schemas.microsoft.com/office/word/2012/wordml" xmlns:w16cex="http://schemas.microsoft.com/office/word/2018/wordml/cex" xmlns:w16cid="http://schemas.microsoft.com/office/word/2016/wordml/cid" xmlns:w16="http://schemas.microsoft.com/office/word/2018/wordml" xmlns:w16du="http://schemas.microsoft.com/office/word/2023/wordml/word16du" xmlns:w16sdtdh="http://schemas.microsoft.com/office/word/2020/wordml/sdtdatahash" xmlns:w16sdtfl="http://schemas.microsoft.com/office/word/2024/wordml/sdtformatlock" xmlns:w16se="http://schemas.microsoft.com/office/word/2015/wordml/symex" mc:Ignorable="w14 w15 w16se w16cid w16 w16cex w16sdtdh w16sdtfl w16du">
+<w:styles xmlns:mc="http://schemas.openxmlformats.org/markup-compatibility/2006" xmlns:r="http://schemas.openxmlformats.org/officeDocument/2006/relationships" xmlns:w="http://schemas.openxmlformats.org/wordprocessingml/2006/main" xmlns:w14="http://schemas.microsoft.com/office/word/2010/wordml" xmlns:w15="http://schemas.microsoft.com/office/word/2012/wordml" xmlns:w16cid="http://schemas.microsoft.com/office/word/2016/wordml/cid" xmlns:w16se="http://schemas.microsoft.com/office/word/2015/wordml/symex" mc:Ignorable="w14 w15 w16se w16cid">
   <w:docDefaults>
     <w:rPrDefault>
       <w:rPr>
@@ -1454,7 +1520,7 @@
       </w:pPr>
     </w:pPrDefault>
   </w:docDefaults>
-  <w:latentStyles w:defLockedState="0" w:defUIPriority="99" w:defSemiHidden="0" w:defUnhideWhenUsed="0" w:defQFormat="0" w:count="376">
+  <w:latentStyles w:defLockedState="0" w:defUIPriority="99" w:defSemiHidden="0" w:defUnhideWhenUsed="0" w:defQFormat="0" w:count="375">
     <w:lsdException w:name="Normal" w:uiPriority="0" w:qFormat="1"/>
     <w:lsdException w:name="heading 1" w:uiPriority="9" w:qFormat="1"/>
     <w:lsdException w:name="heading 2" w:semiHidden="1" w:uiPriority="9" w:unhideWhenUsed="1" w:qFormat="1"/>
@@ -1830,7 +1896,6 @@
     <w:lsdException w:name="Smart Hyperlink" w:semiHidden="1" w:unhideWhenUsed="1"/>
     <w:lsdException w:name="Hashtag" w:semiHidden="1" w:unhideWhenUsed="1"/>
     <w:lsdException w:name="Unresolved Mention" w:semiHidden="1" w:unhideWhenUsed="1"/>
-    <w:lsdException w:name="Smart Link" w:semiHidden="1" w:unhideWhenUsed="1"/>
   </w:latentStyles>
   <w:style w:type="paragraph" w:default="1" w:styleId="Normal">
     <w:name w:val="Normal"/>
@@ -2342,6 +2407,23 @@
 </file>
 
 <file path=customXml/item1.xml><?xml version="1.0" encoding="utf-8"?>
+<p:properties xmlns:p="http://schemas.microsoft.com/office/2006/metadata/properties" xmlns:xsi="http://www.w3.org/2001/XMLSchema-instance" xmlns:pc="http://schemas.microsoft.com/office/infopath/2007/PartnerControls">
+  <documentManagement>
+    <_activity xmlns="4eb9130b-9435-48d9-b87d-905941a3cab1" xsi:nil="true"/>
+  </documentManagement>
+</p:properties>
+</file>
+
+<file path=customXml/item2.xml><?xml version="1.0" encoding="utf-8"?>
+<?mso-contentType ?>
+<FormTemplates xmlns="http://schemas.microsoft.com/sharepoint/v3/contenttype/forms">
+  <Display>DocumentLibraryForm</Display>
+  <Edit>DocumentLibraryForm</Edit>
+  <New>DocumentLibraryForm</New>
+</FormTemplates>
+</file>
+
+<file path=customXml/item3.xml><?xml version="1.0" encoding="utf-8"?>
 <ct:contentTypeSchema xmlns:ct="http://schemas.microsoft.com/office/2006/metadata/contentType" xmlns:ma="http://schemas.microsoft.com/office/2006/metadata/properties/metaAttributes" ct:_="" ma:_="" ma:contentTypeName="Document" ma:contentTypeID="0x0101000502838957C6564BB46506DEC63665BB" ma:contentTypeVersion="17" ma:contentTypeDescription="Create a new document." ma:contentTypeScope="" ma:versionID="9de721930635956eac350533ec31bc30">
   <xsd:schema xmlns:xsd="http://www.w3.org/2001/XMLSchema" xmlns:xs="http://www.w3.org/2001/XMLSchema" xmlns:p="http://schemas.microsoft.com/office/2006/metadata/properties" xmlns:ns3="4eb9130b-9435-48d9-b87d-905941a3cab1" xmlns:ns4="e1a6b317-3158-47d5-a002-ac34399186ce" targetNamespace="http://schemas.microsoft.com/office/2006/metadata/properties" ma:root="true" ma:fieldsID="06d7b2c3b30fb0b79060831e4e3de977" ns3:_="" ns4:_="">
     <xsd:import namespace="4eb9130b-9435-48d9-b87d-905941a3cab1"/>
@@ -2588,24 +2670,32 @@
 </ct:contentTypeSchema>
 </file>
 
-<file path=customXml/item2.xml><?xml version="1.0" encoding="utf-8"?>
-<?mso-contentType ?>
-<FormTemplates xmlns="http://schemas.microsoft.com/sharepoint/v3/contenttype/forms">
-  <Display>DocumentLibraryForm</Display>
-  <Edit>DocumentLibraryForm</Edit>
-  <New>DocumentLibraryForm</New>
-</FormTemplates>
+<file path=customXml/itemProps1.xml><?xml version="1.0" encoding="utf-8"?>
+<ds:datastoreItem xmlns:ds="http://schemas.openxmlformats.org/officeDocument/2006/customXml" ds:itemID="{6CB2E35B-C396-4B31-9F3F-6A78472F0C04}">
+  <ds:schemaRefs>
+    <ds:schemaRef ds:uri="http://schemas.microsoft.com/office/2006/documentManagement/types"/>
+    <ds:schemaRef ds:uri="http://schemas.microsoft.com/office/infopath/2007/PartnerControls"/>
+    <ds:schemaRef ds:uri="http://purl.org/dc/elements/1.1/"/>
+    <ds:schemaRef ds:uri="http://schemas.microsoft.com/office/2006/metadata/properties"/>
+    <ds:schemaRef ds:uri="e1a6b317-3158-47d5-a002-ac34399186ce"/>
+    <ds:schemaRef ds:uri="4eb9130b-9435-48d9-b87d-905941a3cab1"/>
+    <ds:schemaRef ds:uri="http://purl.org/dc/terms/"/>
+    <ds:schemaRef ds:uri="http://schemas.openxmlformats.org/package/2006/metadata/core-properties"/>
+    <ds:schemaRef ds:uri="http://www.w3.org/XML/1998/namespace"/>
+    <ds:schemaRef ds:uri="http://purl.org/dc/dcmitype/"/>
+  </ds:schemaRefs>
+</ds:datastoreItem>
 </file>
 
-<file path=customXml/item3.xml><?xml version="1.0" encoding="utf-8"?>
-<p:properties xmlns:p="http://schemas.microsoft.com/office/2006/metadata/properties" xmlns:xsi="http://www.w3.org/2001/XMLSchema-instance" xmlns:pc="http://schemas.microsoft.com/office/infopath/2007/PartnerControls">
-  <documentManagement>
-    <_activity xmlns="4eb9130b-9435-48d9-b87d-905941a3cab1" xsi:nil="true"/>
-  </documentManagement>
-</p:properties>
+<file path=customXml/itemProps2.xml><?xml version="1.0" encoding="utf-8"?>
+<ds:datastoreItem xmlns:ds="http://schemas.openxmlformats.org/officeDocument/2006/customXml" ds:itemID="{2BBA2231-6BEE-4D73-B372-CB8CFC269061}">
+  <ds:schemaRefs>
+    <ds:schemaRef ds:uri="http://schemas.microsoft.com/sharepoint/v3/contenttype/forms"/>
+  </ds:schemaRefs>
+</ds:datastoreItem>
 </file>
 
-<file path=customXml/itemProps1.xml><?xml version="1.0" encoding="utf-8"?>
+<file path=customXml/itemProps3.xml><?xml version="1.0" encoding="utf-8"?>
 <ds:datastoreItem xmlns:ds="http://schemas.openxmlformats.org/officeDocument/2006/customXml" ds:itemID="{6F97BB9D-21AA-4E87-8B7D-B67E3238F4C4}">
   <ds:schemaRefs>
     <ds:schemaRef ds:uri="http://schemas.microsoft.com/office/2006/metadata/contentType"/>
@@ -2622,22 +2712,4 @@
     <ds:schemaRef ds:uri="http://schemas.microsoft.com/internal/obd"/>
   </ds:schemaRefs>
 </ds:datastoreItem>
-</file>
-
-<file path=customXml/itemProps2.xml><?xml version="1.0" encoding="utf-8"?>
-<ds:datastoreItem xmlns:ds="http://schemas.openxmlformats.org/officeDocument/2006/customXml" ds:itemID="{2BBA2231-6BEE-4D73-B372-CB8CFC269061}">
-  <ds:schemaRefs>
-    <ds:schemaRef ds:uri="http://schemas.microsoft.com/sharepoint/v3/contenttype/forms"/>
-  </ds:schemaRefs>
-</ds:datastoreItem>
-</file>
-
-<file path=customXml/itemProps3.xml><?xml version="1.0" encoding="utf-8"?>
-<ds:datastoreItem xmlns:ds="http://schemas.openxmlformats.org/officeDocument/2006/customXml" ds:itemID="{6CB2E35B-C396-4B31-9F3F-6A78472F0C04}">
-  <ds:schemaRefs>
-    <ds:schemaRef ds:uri="http://schemas.microsoft.com/office/2006/metadata/properties"/>
-    <ds:schemaRef ds:uri="http://schemas.microsoft.com/office/infopath/2007/PartnerControls"/>
-    <ds:schemaRef ds:uri="4eb9130b-9435-48d9-b87d-905941a3cab1"/>
-  </ds:schemaRefs>
-</ds:datastoreItem>
 </file>
</xml_diff>